<commit_message>
QRC: weather sim-vs-experiment overlay from Paper 4 Fig 4b
User supplied Hou et al. Fig 4b; digitized their QRC and QRC+RBF
temperature/humidity curves (approximate, +/-~0.03) and overlaid them on
our simulated results at matching horizons (fig6). Findings: qualitative
advantage reproduces in both (QRC+RBF flattest/highest, beats saturating
ESNs); humidity agrees closely; for temperature our simulation is the
more conservative estimate at long range (h=45: sim 0.67 vs expt 0.82),
plausibly due to reduced FID acquisition (1024 vs 2048) and smaller test
split. Added to results doc, manuscript (Fig 3), and SI (digitized values
tabulated + labelled approximate). Regenerated .docx.

Co-Authored-By: Claude Opus 4.8 (1M context) <noreply@anthropic.com>
</commit_message>
<xml_diff>
--- a/docs/QRC/QRC_Manuscript.docx
+++ b/docs/QRC/QRC_Manuscript.docx
@@ -2154,6 +2154,71 @@
     </w:p>
     <w:p>
       <w:pPr>
+        <w:spacing w:after="120"/>
+        <w:jc w:val="both"/>
+      </w:pPr>
+      <w:r>
+        <w:rPr>
+          <w:b w:val="0"/>
+          <w:i w:val="0"/>
+        </w:rPr>
+        <w:t>A direct comparison with the experiment (Figure 3; Hou et al. Fig. 4b, values digitized and therefore approximate) shows the same qualitative advantage in both simulation and experiment, with QRC+RBF the flattest, highest curve. Quantitatively, humidity agrees closely across horizons, whereas for temperature our simulation is the more conservative estimate at long range (45-day R² ≈ 0.67 simulated vs ≈ 0.82 experimental)—plausibly because this run used a reduced FID acquisition (1024 vs 2048 samples) and a smaller test split than the experiment. The simulation thus reproduces the advantage without overstating it.</w:t>
+      </w:r>
+    </w:p>
+    <w:p>
+      <w:pPr>
+        <w:jc w:val="center"/>
+      </w:pPr>
+      <w:r>
+        <w:drawing>
+          <wp:inline xmlns:a="http://schemas.openxmlformats.org/drawingml/2006/main" xmlns:pic="http://schemas.openxmlformats.org/drawingml/2006/picture">
+            <wp:extent cx="5486400" cy="2498078"/>
+            <wp:docPr id="3" name="Picture 3"/>
+            <wp:cNvGraphicFramePr>
+              <a:graphicFrameLocks noChangeAspect="1"/>
+            </wp:cNvGraphicFramePr>
+            <a:graphic>
+              <a:graphicData uri="http://schemas.openxmlformats.org/drawingml/2006/picture">
+                <pic:pic>
+                  <pic:nvPicPr>
+                    <pic:cNvPr id="0" name="fig6_weather_sim_vs_expt.png"/>
+                    <pic:cNvPicPr/>
+                  </pic:nvPicPr>
+                  <pic:blipFill>
+                    <a:blip r:embed="rId11"/>
+                    <a:stretch>
+                      <a:fillRect/>
+                    </a:stretch>
+                  </pic:blipFill>
+                  <pic:spPr>
+                    <a:xfrm>
+                      <a:off x="0" y="0"/>
+                      <a:ext cx="5486400" cy="2498078"/>
+                    </a:xfrm>
+                    <a:prstGeom prst="rect"/>
+                  </pic:spPr>
+                </pic:pic>
+              </a:graphicData>
+            </a:graphic>
+          </wp:inline>
+        </w:drawing>
+      </w:r>
+    </w:p>
+    <w:p>
+      <w:pPr>
+        <w:spacing w:after="200"/>
+        <w:jc w:val="center"/>
+      </w:pPr>
+      <w:r>
+        <w:rPr>
+          <w:i/>
+          <w:sz w:val="18"/>
+        </w:rPr>
+        <w:t>Figure 3. Temperature (left) and humidity (right) forecast skill: this simulation (solid) versus the Hou et al. experiment (dashed; digitized from their Fig. 4b, approximate). Short-horizon agreement is close; the quantum reservoir’s long-horizon advantage over saturating classical ESNs is present in both.</w:t>
+      </w:r>
+    </w:p>
+    <w:p>
+      <w:pPr>
         <w:pStyle w:val="Heading2"/>
       </w:pPr>
       <w:r>

</xml_diff>

<commit_message>
QRC: add classical-ESN baselines to the weather sim-vs-experiment figure
fig6 now overlays the ESN(500-10000) bands alongside QRC/QRC+RBF for both
this work (exact band) and Hou et al. (digitized from Fig 4b). Shows the
quantum reservoir rising above the saturating ESN band at long horizon in
both simulation and experiment. Updated captions (results doc + manuscript
Fig 3) and regenerated the .docx.

Co-Authored-By: Claude Opus 4.8 (1M context) <noreply@anthropic.com>
</commit_message>
<xml_diff>
--- a/docs/QRC/QRC_Manuscript.docx
+++ b/docs/QRC/QRC_Manuscript.docx
@@ -2172,7 +2172,7 @@
       <w:r>
         <w:drawing>
           <wp:inline xmlns:a="http://schemas.openxmlformats.org/drawingml/2006/main" xmlns:pic="http://schemas.openxmlformats.org/drawingml/2006/picture">
-            <wp:extent cx="5486400" cy="2498078"/>
+            <wp:extent cx="5486400" cy="2301986"/>
             <wp:docPr id="3" name="Picture 3"/>
             <wp:cNvGraphicFramePr>
               <a:graphicFrameLocks noChangeAspect="1"/>
@@ -2193,7 +2193,7 @@
                   <pic:spPr>
                     <a:xfrm>
                       <a:off x="0" y="0"/>
-                      <a:ext cx="5486400" cy="2498078"/>
+                      <a:ext cx="5486400" cy="2301986"/>
                     </a:xfrm>
                     <a:prstGeom prst="rect"/>
                   </pic:spPr>
@@ -2214,7 +2214,7 @@
           <w:i/>
           <w:sz w:val="18"/>
         </w:rPr>
-        <w:t>Figure 3. Temperature (left) and humidity (right) forecast skill: this simulation (solid) versus the Hou et al. experiment (dashed; digitized from their Fig. 4b, approximate). Short-horizon agreement is close; the quantum reservoir’s long-horizon advantage over saturating classical ESNs is present in both.</w:t>
+        <w:t>Figure 3. Temperature (left) and humidity (right) forecast skill: this simulation (solid lines) versus the Hou et al. experiment (dashed lines; digitized from their Fig. 4b, approximate). Shaded regions are the classical ESN(500–10000) bands for this work (blue) and the experiment (red). In both, the QRC—and especially QRC+RBF—rises above the ESN band at long horizon, where the ESN saturates; short-horizon agreement between simulation and experiment is close.</w:t>
       </w:r>
     </w:p>
     <w:p>

</xml_diff>

<commit_message>
Finalize paper: Mackey-Glass h=10 QRC win confirmed multi-seed (3/3)
mackey-h10-confirm-2d21b56f (seeds 2,3) + seed 1: MG h=10 perspin 0.00155+/-0.00018
(3 seeds), beats tuned-LSTM 0.0024 (3/3) and ESN 0.0057 (3/3), >> arcsin 0.030.

- Manuscript (.tex/.md/.docx): drop single-seed caveat; MG h=10 = 0.00155+/-0.00018,
  ratios ~1.6x (LSTM) / ~3.7x (ESN); abstract/results/discussion/conclusion updated.
- Figures regenerated: mean+/-std error bars on the quantum-mediated + task-dependent
  bars; figP4 now the REAL learned per-spin encoding map + encoder training curve
  (from the saved encoding_detail.json); figP4 added to the .tex.
- Finding doc + status tracker (.md/.html) updated. .tex validated (balanced, 4 figs).

Co-Authored-By: Claude Opus 4.8 (1M context) <noreply@anthropic.com>
</commit_message>
<xml_diff>
--- a/docs/QRC/QRC_Manuscript.docx
+++ b/docs/QRC/QRC_Manuscript.docx
@@ -262,12 +262,12 @@
     </w:p>
     <w:p>
       <w:r>
-        <w:t>(Mackey-Glass, h=10) the learned QRC outperforms both a tuned LSTM (~1.9×) and the</w:t>
-      </w:r>
-    </w:p>
-    <w:p>
-      <w:r>
-        <w:t>ESN (~4.4×) (single-seed, multi-seed confirmation in progress). The advantage of the</w:t>
+        <w:t>(Mackey-Glass, h=10) the learned QRC outperforms both a tuned LSTM (~1.6×) and the</w:t>
+      </w:r>
+    </w:p>
+    <w:p>
+      <w:r>
+        <w:t>ESN (~3.7×), confirmed across three seeds (0.00155 ± 0.00018). The advantage of the</w:t>
       </w:r>
     </w:p>
     <w:p>
@@ -3433,6 +3433,9 @@
               </w:rPr>
               <w:t>Mackey-Glass h=10</w:t>
             </w:r>
+            <w:r>
+              <w:t xml:space="preserve"> (3)</w:t>
+            </w:r>
           </w:p>
         </w:tc>
         <w:tc>
@@ -3444,10 +3447,7 @@
               <w:rPr>
                 <w:b/>
               </w:rPr>
-              <w:t>0.0013</w:t>
-            </w:r>
-            <w:r>
-              <w:t xml:space="preserve"> †</w:t>
+              <w:t>0.00155 ± 0.00018</w:t>
             </w:r>
           </w:p>
         </w:tc>
@@ -3489,7 +3489,7 @@
     <w:p/>
     <w:p>
       <w:r>
-        <w:t xml:space="preserve">† single seed (run </w:t>
+        <w:t>Confirmed across 3 seeds (</w:t>
       </w:r>
       <w:r>
         <w:rPr>
@@ -3499,7 +3499,17 @@
         <w:t>learnable-0a45c7b0</w:t>
       </w:r>
       <w:r>
-        <w:t>); multi-seed confirmation pending.</w:t>
+        <w:t xml:space="preserve"> + </w:t>
+      </w:r>
+      <w:r>
+        <w:rPr>
+          <w:rFonts w:ascii="Consolas" w:hAnsi="Consolas"/>
+          <w:sz w:val="19"/>
+        </w:rPr>
+        <w:t>mackey-h10-confirm-2d21b56f</w:t>
+      </w:r>
+      <w:r>
+        <w:t>): 0.00155 ± 0.00018, beating both classical baselines 3/3.</w:t>
       </w:r>
     </w:p>
     <w:p>
@@ -3568,35 +3578,30 @@
         <w:rPr>
           <w:b/>
         </w:rPr>
-        <w:t>learned QRC outperforms both the tuned LSTM (~1.9×) and the ESN (~4.4×)</w:t>
-      </w:r>
-      <w:r>
-        <w:t>.</w:t>
-      </w:r>
-    </w:p>
-    <w:p>
-      <w:r>
-        <w:t>The advantage of the physics-informed, learnable-encoding QRC thus appears</w:t>
-      </w:r>
-    </w:p>
-    <w:p>
-      <w:r>
-        <w:t>specifically where nonlinear fading memory is essential and simple reservoirs</w:t>
-      </w:r>
-    </w:p>
-    <w:p>
-      <w:r>
-        <w:t>struggle — not on tasks that favour a large linear-memory reservoir. This h=10</w:t>
-      </w:r>
-    </w:p>
-    <w:p>
-      <w:r>
-        <w:t>result is currently single-seed and is being extended to multiple seeds before it is</w:t>
-      </w:r>
-    </w:p>
-    <w:p>
-      <w:r>
-        <w:t>advanced as a firm claim.</w:t>
+        <w:t>learned QRC outperforms both the tuned LSTM (~1.6×) and the ESN (~3.7×)</w:t>
+      </w:r>
+      <w:r>
+        <w:t>,</w:t>
+      </w:r>
+    </w:p>
+    <w:p>
+      <w:r>
+        <w:t>confirmed across three seeds (0.00155 ± 0.00018, beating both 3/3). The advantage of</w:t>
+      </w:r>
+    </w:p>
+    <w:p>
+      <w:r>
+        <w:t>the physics-informed, learnable-encoding QRC thus appears specifically where nonlinear</w:t>
+      </w:r>
+    </w:p>
+    <w:p>
+      <w:r>
+        <w:t>fading memory is essential and simple reservoirs struggle — not on tasks that favour a</w:t>
+      </w:r>
+    </w:p>
+    <w:p>
+      <w:r>
+        <w:t>large linear-memory reservoir.</w:t>
       </w:r>
     </w:p>
     <w:p>
@@ -3821,7 +3826,7 @@
       <w:r>
         <w:drawing>
           <wp:inline xmlns:a="http://schemas.openxmlformats.org/drawingml/2006/main" xmlns:pic="http://schemas.openxmlformats.org/drawingml/2006/picture">
-            <wp:extent cx="5669280" cy="3501261"/>
+            <wp:extent cx="5669280" cy="2180781"/>
             <wp:docPr id="4" name="Picture 4"/>
             <wp:cNvGraphicFramePr>
               <a:graphicFrameLocks noChangeAspect="1"/>
@@ -3842,7 +3847,7 @@
                   <pic:spPr>
                     <a:xfrm>
                       <a:off x="0" y="0"/>
-                      <a:ext cx="5669280" cy="3501261"/>
+                      <a:ext cx="5669280" cy="2180781"/>
                     </a:xfrm>
                     <a:prstGeom prst="rect"/>
                   </pic:spPr>
@@ -3861,7 +3866,12 @@
         <w:t>FIG. 4.</w:t>
       </w:r>
       <w:r>
-        <w:t xml:space="preserve"> The learned per-spin encoding map compared to </w:t>
+        <w:t xml:space="preserve"> *(left)* The gradient-trained per-spin encoding map (each spin a distinct,</w:t>
+      </w:r>
+    </w:p>
+    <w:p>
+      <w:r>
+        <w:t xml:space="preserve">frequency-selective curve) compared to </w:t>
       </w:r>
       <w:r>
         <w:rPr>
@@ -3870,10 +3880,13 @@
         </w:rPr>
         <w:t>arcsin(√s)</w:t>
       </w:r>
-    </w:p>
-    <w:p>
-      <w:r>
-        <w:t>(finalized from the multi-seed runs).</w:t>
+      <w:r>
+        <w:t>; *(right)* the encoder</w:t>
+      </w:r>
+    </w:p>
+    <w:p>
+      <w:r>
+        <w:t>validation-loss curve over 100 Adam steps (Mackey-Glass h=10).</w:t>
       </w:r>
     </w:p>
     <w:p>
@@ -3986,7 +3999,7 @@
     </w:p>
     <w:p>
       <w:r>
-        <w:t>chaotic prediction (Mackey-Glass h=10), where nonlinear fading memory is essential</w:t>
+        <w:t>chaotic prediction (Mackey-Glass h=10, confirmed 3/3 seeds), where nonlinear fading memory is essential</w:t>
       </w:r>
     </w:p>
     <w:p>
@@ -4006,22 +4019,17 @@
     </w:p>
     <w:p>
       <w:r>
-        <w:t>memory rather than raw linear-memory capacity. We state this cautiously: the h=10</w:t>
-      </w:r>
-    </w:p>
-    <w:p>
-      <w:r>
-        <w:t>result is single-seed pending multi-seed confirmation, and a decisive many-body</w:t>
-      </w:r>
-    </w:p>
-    <w:p>
-      <w:r>
-        <w:t>quantum advantage across task classes would still require entangling dynamics faster</w:t>
-      </w:r>
-    </w:p>
-    <w:p>
-      <w:r>
-        <w:t xml:space="preserve">than decoherence (long </w:t>
+        <w:t>memory rather than raw linear-memory capacity. The h=10 advantage is confirmed across</w:t>
+      </w:r>
+    </w:p>
+    <w:p>
+      <w:r>
+        <w:t>three seeds; nonetheless a decisive many-body quantum advantage across task classes</w:t>
+      </w:r>
+    </w:p>
+    <w:p>
+      <w:r>
+        <w:t xml:space="preserve">would still require entangling dynamics faster than decoherence (long </w:t>
       </w:r>
       <w:r>
         <w:rPr>
@@ -4031,12 +4039,12 @@
         <w:t>T₂</w:t>
       </w:r>
       <w:r>
-        <w:t xml:space="preserve"> × strong coupling), a regime our substrate does not</w:t>
-      </w:r>
-    </w:p>
-    <w:p>
-      <w:r>
-        <w:t>reach.</w:t>
+        <w:t xml:space="preserve"> × strong</w:t>
+      </w:r>
+    </w:p>
+    <w:p>
+      <w:r>
+        <w:t>coupling), a regime our substrate does not reach.</w:t>
       </w:r>
     </w:p>
     <w:p>

</xml_diff>